<commit_message>
fixing the sequential models
</commit_message>
<xml_diff>
--- a/Scripts/04_Final_Analysis.docx
+++ b/Scripts/04_Final_Analysis.docx
@@ -1605,55 +1605,55 @@
                 <w:rFonts w:ascii="Calibri" w:hAnsi="Calibri"/>
                 <w:sz w:val="20"/>
               </w:rPr>
-              <w:t xml:space="default">    Male</w:t>
-            </w:r>
-          </w:p>
-        </w:tc>
-        <w:tc>
-          <w:tcPr>
-            <w:tcBorders>
-              <w:top w:val="single" w:space="0" w:color="D3D3D3"/>
-              <w:bottom w:val="single" w:space="0" w:color="D3D3D3"/>
-              <w:start w:val="single" w:space="0" w:color="D3D3D3"/>
-              <w:end w:val="single" w:space="0" w:color="D3D3D3"/>
-            </w:tcBorders>
-          </w:tcPr>
-          <w:p>
-            <w:pPr>
-              <w:spacing w:before="0" w:after="60"/>
-              <w:keepNext/>
-              <w:jc w:val="center"/>
-            </w:pPr>
-            <w:r>
-              <w:rPr>
-                <w:rFonts w:ascii="Calibri" w:hAnsi="Calibri"/>
-                <w:sz w:val="20"/>
-              </w:rPr>
-              <w:t xml:space="default">5,803,818 (51%)</w:t>
-            </w:r>
-          </w:p>
-        </w:tc>
-        <w:tc>
-          <w:tcPr>
-            <w:tcBorders>
-              <w:top w:val="single" w:space="0" w:color="D3D3D3"/>
-              <w:bottom w:val="single" w:space="0" w:color="D3D3D3"/>
-              <w:start w:val="single" w:space="0" w:color="D3D3D3"/>
-              <w:end w:val="single" w:space="0" w:color="D3D3D3"/>
-            </w:tcBorders>
-          </w:tcPr>
-          <w:p>
-            <w:pPr>
-              <w:spacing w:before="0" w:after="60"/>
-              <w:keepNext/>
-              <w:jc w:val="center"/>
-            </w:pPr>
-            <w:r>
-              <w:rPr>
-                <w:rFonts w:ascii="Calibri" w:hAnsi="Calibri"/>
-                <w:sz w:val="20"/>
-              </w:rPr>
-              <w:t xml:space="default">3,827,223 (51%)</w:t>
+              <w:t xml:space="default">    Female</w:t>
+            </w:r>
+          </w:p>
+        </w:tc>
+        <w:tc>
+          <w:tcPr>
+            <w:tcBorders>
+              <w:top w:val="single" w:space="0" w:color="D3D3D3"/>
+              <w:bottom w:val="single" w:space="0" w:color="D3D3D3"/>
+              <w:start w:val="single" w:space="0" w:color="D3D3D3"/>
+              <w:end w:val="single" w:space="0" w:color="D3D3D3"/>
+            </w:tcBorders>
+          </w:tcPr>
+          <w:p>
+            <w:pPr>
+              <w:spacing w:before="0" w:after="60"/>
+              <w:keepNext/>
+              <w:jc w:val="center"/>
+            </w:pPr>
+            <w:r>
+              <w:rPr>
+                <w:rFonts w:ascii="Calibri" w:hAnsi="Calibri"/>
+                <w:sz w:val="20"/>
+              </w:rPr>
+              <w:t xml:space="default">5,595,639 (49%)</w:t>
+            </w:r>
+          </w:p>
+        </w:tc>
+        <w:tc>
+          <w:tcPr>
+            <w:tcBorders>
+              <w:top w:val="single" w:space="0" w:color="D3D3D3"/>
+              <w:bottom w:val="single" w:space="0" w:color="D3D3D3"/>
+              <w:start w:val="single" w:space="0" w:color="D3D3D3"/>
+              <w:end w:val="single" w:space="0" w:color="D3D3D3"/>
+            </w:tcBorders>
+          </w:tcPr>
+          <w:p>
+            <w:pPr>
+              <w:spacing w:before="0" w:after="60"/>
+              <w:keepNext/>
+              <w:jc w:val="center"/>
+            </w:pPr>
+            <w:r>
+              <w:rPr>
+                <w:rFonts w:ascii="Calibri" w:hAnsi="Calibri"/>
+                <w:sz w:val="20"/>
+              </w:rPr>
+              <w:t xml:space="default">3,640,357 (49%)</w:t>
             </w:r>
           </w:p>
         </w:tc>
@@ -1706,55 +1706,55 @@
                 <w:rFonts w:ascii="Calibri" w:hAnsi="Calibri"/>
                 <w:sz w:val="20"/>
               </w:rPr>
-              <w:t xml:space="default">    Female</w:t>
-            </w:r>
-          </w:p>
-        </w:tc>
-        <w:tc>
-          <w:tcPr>
-            <w:tcBorders>
-              <w:top w:val="single" w:space="0" w:color="D3D3D3"/>
-              <w:bottom w:val="single" w:space="0" w:color="D3D3D3"/>
-              <w:start w:val="single" w:space="0" w:color="D3D3D3"/>
-              <w:end w:val="single" w:space="0" w:color="D3D3D3"/>
-            </w:tcBorders>
-          </w:tcPr>
-          <w:p>
-            <w:pPr>
-              <w:spacing w:before="0" w:after="60"/>
-              <w:keepNext/>
-              <w:jc w:val="center"/>
-            </w:pPr>
-            <w:r>
-              <w:rPr>
-                <w:rFonts w:ascii="Calibri" w:hAnsi="Calibri"/>
-                <w:sz w:val="20"/>
-              </w:rPr>
-              <w:t xml:space="default">5,595,639 (49%)</w:t>
-            </w:r>
-          </w:p>
-        </w:tc>
-        <w:tc>
-          <w:tcPr>
-            <w:tcBorders>
-              <w:top w:val="single" w:space="0" w:color="D3D3D3"/>
-              <w:bottom w:val="single" w:space="0" w:color="D3D3D3"/>
-              <w:start w:val="single" w:space="0" w:color="D3D3D3"/>
-              <w:end w:val="single" w:space="0" w:color="D3D3D3"/>
-            </w:tcBorders>
-          </w:tcPr>
-          <w:p>
-            <w:pPr>
-              <w:spacing w:before="0" w:after="60"/>
-              <w:keepNext/>
-              <w:jc w:val="center"/>
-            </w:pPr>
-            <w:r>
-              <w:rPr>
-                <w:rFonts w:ascii="Calibri" w:hAnsi="Calibri"/>
-                <w:sz w:val="20"/>
-              </w:rPr>
-              <w:t xml:space="default">3,640,357 (49%)</w:t>
+              <w:t xml:space="default">    Male</w:t>
+            </w:r>
+          </w:p>
+        </w:tc>
+        <w:tc>
+          <w:tcPr>
+            <w:tcBorders>
+              <w:top w:val="single" w:space="0" w:color="D3D3D3"/>
+              <w:bottom w:val="single" w:space="0" w:color="D3D3D3"/>
+              <w:start w:val="single" w:space="0" w:color="D3D3D3"/>
+              <w:end w:val="single" w:space="0" w:color="D3D3D3"/>
+            </w:tcBorders>
+          </w:tcPr>
+          <w:p>
+            <w:pPr>
+              <w:spacing w:before="0" w:after="60"/>
+              <w:keepNext/>
+              <w:jc w:val="center"/>
+            </w:pPr>
+            <w:r>
+              <w:rPr>
+                <w:rFonts w:ascii="Calibri" w:hAnsi="Calibri"/>
+                <w:sz w:val="20"/>
+              </w:rPr>
+              <w:t xml:space="default">5,803,818 (51%)</w:t>
+            </w:r>
+          </w:p>
+        </w:tc>
+        <w:tc>
+          <w:tcPr>
+            <w:tcBorders>
+              <w:top w:val="single" w:space="0" w:color="D3D3D3"/>
+              <w:bottom w:val="single" w:space="0" w:color="D3D3D3"/>
+              <w:start w:val="single" w:space="0" w:color="D3D3D3"/>
+              <w:end w:val="single" w:space="0" w:color="D3D3D3"/>
+            </w:tcBorders>
+          </w:tcPr>
+          <w:p>
+            <w:pPr>
+              <w:spacing w:before="0" w:after="60"/>
+              <w:keepNext/>
+              <w:jc w:val="center"/>
+            </w:pPr>
+            <w:r>
+              <w:rPr>
+                <w:rFonts w:ascii="Calibri" w:hAnsi="Calibri"/>
+                <w:sz w:val="20"/>
+              </w:rPr>
+              <w:t xml:space="default">3,827,223 (51%)</w:t>
             </w:r>
           </w:p>
         </w:tc>
@@ -7959,7 +7959,7 @@
         <w:rPr>
           <w:rStyle w:val="VerbatimChar"/>
         </w:rPr>
-        <w:t xml:space="preserve">##  1 (Intercept)                        0.08   0.06    0.12 &lt; .001 </w:t>
+        <w:t xml:space="preserve">##  1 (Intercept)                        0.04   0.03    0.06 &lt; .001 </w:t>
       </w:r>
       <w:r>
         <w:br/>
@@ -7977,7 +7977,7 @@
         <w:rPr>
           <w:rStyle w:val="VerbatimChar"/>
         </w:rPr>
-        <w:t xml:space="preserve">##  3 sexFemale                          0.54   0.44    0.66 &lt; .001 </w:t>
+        <w:t xml:space="preserve">##  3 sexMale                            1.85   1.51    2.27 &lt; .001 </w:t>
       </w:r>
       <w:r>
         <w:br/>
@@ -8823,7 +8823,7 @@
         <w:rPr>
           <w:rStyle w:val="VerbatimChar"/>
         </w:rPr>
-        <w:t xml:space="preserve">##  1 (Intercept)                        0.05   0.02    0.1  &lt; .001 </w:t>
+        <w:t xml:space="preserve">##  1 (Intercept)                        0.04   0.02    0.08 &lt; .001 </w:t>
       </w:r>
       <w:r>
         <w:br/>
@@ -8841,7 +8841,7 @@
         <w:rPr>
           <w:rStyle w:val="VerbatimChar"/>
         </w:rPr>
-        <w:t xml:space="preserve">##  3 sexFemale                          0.79   0.56    1.11 0.17   </w:t>
+        <w:t xml:space="preserve">##  3 sexMale                            1.27   0.9     1.78 0.17   </w:t>
       </w:r>
       <w:r>
         <w:br/>
@@ -9741,7 +9741,7 @@
         <w:rPr>
           <w:rStyle w:val="VerbatimChar"/>
         </w:rPr>
-        <w:t xml:space="preserve">##  1 (Intercept)                        0.01   0       0.09 &lt; .001 </w:t>
+        <w:t xml:space="preserve">##  1 (Intercept)                        0.01   0       0.08 &lt; .001 </w:t>
       </w:r>
       <w:r>
         <w:br/>
@@ -9759,7 +9759,7 @@
         <w:rPr>
           <w:rStyle w:val="VerbatimChar"/>
         </w:rPr>
-        <w:t xml:space="preserve">##  3 sexFemale                          1.01   0.59    1.74 0.96   </w:t>
+        <w:t xml:space="preserve">##  3 sexMale                            0.99   0.58    1.69 0.96   </w:t>
       </w:r>
       <w:r>
         <w:br/>
@@ -11574,55 +11574,55 @@
                 <w:rFonts w:ascii="Calibri" w:hAnsi="Calibri"/>
                 <w:sz w:val="20"/>
               </w:rPr>
-              <w:t xml:space="default">    Male</w:t>
-            </w:r>
-          </w:p>
-        </w:tc>
-        <w:tc>
-          <w:tcPr>
-            <w:tcBorders>
-              <w:top w:val="single" w:space="0" w:color="D3D3D3"/>
-              <w:bottom w:val="single" w:space="0" w:color="D3D3D3"/>
-              <w:start w:val="single" w:space="0" w:color="D3D3D3"/>
-              <w:end w:val="single" w:space="0" w:color="D3D3D3"/>
-            </w:tcBorders>
-          </w:tcPr>
-          <w:p>
-            <w:pPr>
-              <w:spacing w:before="0" w:after="60"/>
-              <w:keepNext/>
-              <w:jc w:val="center"/>
-            </w:pPr>
-            <w:r>
-              <w:rPr>
-                <w:rFonts w:ascii="Calibri" w:hAnsi="Calibri"/>
-                <w:sz w:val="20"/>
-              </w:rPr>
-              <w:t xml:space="default">4,627,255 (51%)</w:t>
-            </w:r>
-          </w:p>
-        </w:tc>
-        <w:tc>
-          <w:tcPr>
-            <w:tcBorders>
-              <w:top w:val="single" w:space="0" w:color="D3D3D3"/>
-              <w:bottom w:val="single" w:space="0" w:color="D3D3D3"/>
-              <w:start w:val="single" w:space="0" w:color="D3D3D3"/>
-              <w:end w:val="single" w:space="0" w:color="D3D3D3"/>
-            </w:tcBorders>
-          </w:tcPr>
-          <w:p>
-            <w:pPr>
-              <w:spacing w:before="0" w:after="60"/>
-              <w:keepNext/>
-              <w:jc w:val="center"/>
-            </w:pPr>
-            <w:r>
-              <w:rPr>
-                <w:rFonts w:ascii="Calibri" w:hAnsi="Calibri"/>
-                <w:sz w:val="20"/>
-              </w:rPr>
-              <w:t xml:space="default">3,206,707 (51%)</w:t>
+              <w:t xml:space="default">    Female</w:t>
+            </w:r>
+          </w:p>
+        </w:tc>
+        <w:tc>
+          <w:tcPr>
+            <w:tcBorders>
+              <w:top w:val="single" w:space="0" w:color="D3D3D3"/>
+              <w:bottom w:val="single" w:space="0" w:color="D3D3D3"/>
+              <w:start w:val="single" w:space="0" w:color="D3D3D3"/>
+              <w:end w:val="single" w:space="0" w:color="D3D3D3"/>
+            </w:tcBorders>
+          </w:tcPr>
+          <w:p>
+            <w:pPr>
+              <w:spacing w:before="0" w:after="60"/>
+              <w:keepNext/>
+              <w:jc w:val="center"/>
+            </w:pPr>
+            <w:r>
+              <w:rPr>
+                <w:rFonts w:ascii="Calibri" w:hAnsi="Calibri"/>
+                <w:sz w:val="20"/>
+              </w:rPr>
+              <w:t xml:space="default">4,414,585 (49%)</w:t>
+            </w:r>
+          </w:p>
+        </w:tc>
+        <w:tc>
+          <w:tcPr>
+            <w:tcBorders>
+              <w:top w:val="single" w:space="0" w:color="D3D3D3"/>
+              <w:bottom w:val="single" w:space="0" w:color="D3D3D3"/>
+              <w:start w:val="single" w:space="0" w:color="D3D3D3"/>
+              <w:end w:val="single" w:space="0" w:color="D3D3D3"/>
+            </w:tcBorders>
+          </w:tcPr>
+          <w:p>
+            <w:pPr>
+              <w:spacing w:before="0" w:after="60"/>
+              <w:keepNext/>
+              <w:jc w:val="center"/>
+            </w:pPr>
+            <w:r>
+              <w:rPr>
+                <w:rFonts w:ascii="Calibri" w:hAnsi="Calibri"/>
+                <w:sz w:val="20"/>
+              </w:rPr>
+              <w:t xml:space="default">3,104,871 (49%)</w:t>
             </w:r>
           </w:p>
         </w:tc>
@@ -11675,55 +11675,55 @@
                 <w:rFonts w:ascii="Calibri" w:hAnsi="Calibri"/>
                 <w:sz w:val="20"/>
               </w:rPr>
-              <w:t xml:space="default">    Female</w:t>
-            </w:r>
-          </w:p>
-        </w:tc>
-        <w:tc>
-          <w:tcPr>
-            <w:tcBorders>
-              <w:top w:val="single" w:space="0" w:color="D3D3D3"/>
-              <w:bottom w:val="single" w:space="0" w:color="D3D3D3"/>
-              <w:start w:val="single" w:space="0" w:color="D3D3D3"/>
-              <w:end w:val="single" w:space="0" w:color="D3D3D3"/>
-            </w:tcBorders>
-          </w:tcPr>
-          <w:p>
-            <w:pPr>
-              <w:spacing w:before="0" w:after="60"/>
-              <w:keepNext/>
-              <w:jc w:val="center"/>
-            </w:pPr>
-            <w:r>
-              <w:rPr>
-                <w:rFonts w:ascii="Calibri" w:hAnsi="Calibri"/>
-                <w:sz w:val="20"/>
-              </w:rPr>
-              <w:t xml:space="default">4,414,585 (49%)</w:t>
-            </w:r>
-          </w:p>
-        </w:tc>
-        <w:tc>
-          <w:tcPr>
-            <w:tcBorders>
-              <w:top w:val="single" w:space="0" w:color="D3D3D3"/>
-              <w:bottom w:val="single" w:space="0" w:color="D3D3D3"/>
-              <w:start w:val="single" w:space="0" w:color="D3D3D3"/>
-              <w:end w:val="single" w:space="0" w:color="D3D3D3"/>
-            </w:tcBorders>
-          </w:tcPr>
-          <w:p>
-            <w:pPr>
-              <w:spacing w:before="0" w:after="60"/>
-              <w:keepNext/>
-              <w:jc w:val="center"/>
-            </w:pPr>
-            <w:r>
-              <w:rPr>
-                <w:rFonts w:ascii="Calibri" w:hAnsi="Calibri"/>
-                <w:sz w:val="20"/>
-              </w:rPr>
-              <w:t xml:space="default">3,104,871 (49%)</w:t>
+              <w:t xml:space="default">    Male</w:t>
+            </w:r>
+          </w:p>
+        </w:tc>
+        <w:tc>
+          <w:tcPr>
+            <w:tcBorders>
+              <w:top w:val="single" w:space="0" w:color="D3D3D3"/>
+              <w:bottom w:val="single" w:space="0" w:color="D3D3D3"/>
+              <w:start w:val="single" w:space="0" w:color="D3D3D3"/>
+              <w:end w:val="single" w:space="0" w:color="D3D3D3"/>
+            </w:tcBorders>
+          </w:tcPr>
+          <w:p>
+            <w:pPr>
+              <w:spacing w:before="0" w:after="60"/>
+              <w:keepNext/>
+              <w:jc w:val="center"/>
+            </w:pPr>
+            <w:r>
+              <w:rPr>
+                <w:rFonts w:ascii="Calibri" w:hAnsi="Calibri"/>
+                <w:sz w:val="20"/>
+              </w:rPr>
+              <w:t xml:space="default">4,627,255 (51%)</w:t>
+            </w:r>
+          </w:p>
+        </w:tc>
+        <w:tc>
+          <w:tcPr>
+            <w:tcBorders>
+              <w:top w:val="single" w:space="0" w:color="D3D3D3"/>
+              <w:bottom w:val="single" w:space="0" w:color="D3D3D3"/>
+              <w:start w:val="single" w:space="0" w:color="D3D3D3"/>
+              <w:end w:val="single" w:space="0" w:color="D3D3D3"/>
+            </w:tcBorders>
+          </w:tcPr>
+          <w:p>
+            <w:pPr>
+              <w:spacing w:before="0" w:after="60"/>
+              <w:keepNext/>
+              <w:jc w:val="center"/>
+            </w:pPr>
+            <w:r>
+              <w:rPr>
+                <w:rFonts w:ascii="Calibri" w:hAnsi="Calibri"/>
+                <w:sz w:val="20"/>
+              </w:rPr>
+              <w:t xml:space="default">3,206,707 (51%)</w:t>
             </w:r>
           </w:p>
         </w:tc>
@@ -17557,7 +17557,7 @@
         <w:rPr>
           <w:rStyle w:val="VerbatimChar"/>
         </w:rPr>
-        <w:t xml:space="preserve">##  1 (Intercept)                        0.11   0.08    0.15 &lt; .001 </w:t>
+        <w:t xml:space="preserve">##  1 (Intercept)                        0.06   0.04    0.08 &lt; .001 </w:t>
       </w:r>
       <w:r>
         <w:br/>
@@ -17575,7 +17575,7 @@
         <w:rPr>
           <w:rStyle w:val="VerbatimChar"/>
         </w:rPr>
-        <w:t xml:space="preserve">##  3 sexFemale                          0.54   0.44    0.67 &lt; .001 </w:t>
+        <w:t xml:space="preserve">##  3 sexMale                            1.84   1.49    2.27 &lt; .001 </w:t>
       </w:r>
       <w:r>
         <w:br/>
@@ -18338,7 +18338,7 @@
         <w:rPr>
           <w:rStyle w:val="VerbatimChar"/>
         </w:rPr>
-        <w:t xml:space="preserve">##  1 (Intercept)                        0.06   0.03    0.13 &lt; .001 </w:t>
+        <w:t xml:space="preserve">##  1 (Intercept)                        0.05   0.02    0.09 &lt; .001 </w:t>
       </w:r>
       <w:r>
         <w:br/>
@@ -18356,7 +18356,7 @@
         <w:rPr>
           <w:rStyle w:val="VerbatimChar"/>
         </w:rPr>
-        <w:t xml:space="preserve">##  3 sexFemale                          0.75   0.52    1.08 0.12   </w:t>
+        <w:t xml:space="preserve">##  3 sexMale                            1.34   0.93    1.94 0.12   </w:t>
       </w:r>
       <w:r>
         <w:br/>

</xml_diff>